<commit_message>
Align logistics supervision date placeholders
</commit_message>
<xml_diff>
--- a/backend_api/templates/vessel_truck_supervision.docx
+++ b/backend_api/templates/vessel_truck_supervision.docx
@@ -452,7 +452,7 @@
           <w:numId w:val="1"/>
         </w:numPr>
         <w:tabs>
-          <w:tab w:val="num" w:pos="1560"/>
+          <w:tab w:pos="6984" w:val="left"/>
         </w:tabs>
         <w:spacing w:before="200"/>
         <w:jc w:val="both"/>
@@ -464,33 +464,31 @@
         <w:rPr>
           <w:lang w:val="es-CR"/>
         </w:rPr>
-        <w:t xml:space="preserve">Fechas de Arribo </w:t>
-      </w:r>
-      <w:r>
-        <w:rPr>
-          <w:lang w:val="es-CR"/>
-        </w:rPr>
-        <w:t xml:space="preserve">              </w:t>
-      </w:r>
-      <w:r>
-        <w:rPr>
-          <w:lang w:val="es-CR"/>
-        </w:rPr>
-        <w:t>{</w:t>
+        <w:t>Fechas de Arribo</w:t>
+        <w:tab/>
+        <w:t>{arrival_date}</w:t>
+      </w:r>
+      <w:r>
+        <w:rPr>
+          <w:lang w:val="es-CR"/>
+        </w:rPr>
+      </w:r>
+      <w:r>
+        <w:rPr>
+          <w:lang w:val="es-CR"/>
+        </w:rPr>
       </w:r>
       <w:proofErr w:type="spellStart"/>
       <w:r>
         <w:rPr>
           <w:lang w:val="es-CR"/>
         </w:rPr>
-        <w:t>arrival_date</w:t>
       </w:r>
       <w:proofErr w:type="spellEnd"/>
       <w:r>
         <w:rPr>
           <w:lang w:val="es-CR"/>
         </w:rPr>
-        <w:t>}</w:t>
       </w:r>
     </w:p>
     <w:p>
@@ -500,7 +498,7 @@
           <w:numId w:val="1"/>
         </w:numPr>
         <w:tabs>
-          <w:tab w:val="num" w:pos="1560"/>
+          <w:tab w:pos="6984" w:val="left"/>
         </w:tabs>
         <w:spacing w:before="200"/>
         <w:jc w:val="both"/>
@@ -512,33 +510,31 @@
         <w:rPr>
           <w:lang w:val="es-CR"/>
         </w:rPr>
-        <w:t xml:space="preserve">Fecha de inspección      </w:t>
-      </w:r>
-      <w:r>
-        <w:rPr>
-          <w:lang w:val="es-CR"/>
-        </w:rPr>
-        <w:t xml:space="preserve">    </w:t>
-      </w:r>
-      <w:r>
-        <w:rPr>
-          <w:lang w:val="es-CR"/>
-        </w:rPr>
-        <w:t>{</w:t>
+        <w:t>Fecha de inspección</w:t>
+        <w:tab/>
+        <w:t>{inspection_date}</w:t>
+      </w:r>
+      <w:r>
+        <w:rPr>
+          <w:lang w:val="es-CR"/>
+        </w:rPr>
+      </w:r>
+      <w:r>
+        <w:rPr>
+          <w:lang w:val="es-CR"/>
+        </w:rPr>
       </w:r>
       <w:proofErr w:type="spellStart"/>
       <w:r>
         <w:rPr>
           <w:lang w:val="es-CR"/>
         </w:rPr>
-        <w:t>inspection_date</w:t>
       </w:r>
       <w:proofErr w:type="spellEnd"/>
       <w:r>
         <w:rPr>
           <w:lang w:val="es-CR"/>
         </w:rPr>
-        <w:t>}</w:t>
       </w:r>
     </w:p>
     <w:p>
@@ -548,7 +544,7 @@
           <w:numId w:val="1"/>
         </w:numPr>
         <w:tabs>
-          <w:tab w:val="num" w:pos="1560"/>
+          <w:tab w:pos="6984" w:val="left"/>
         </w:tabs>
         <w:spacing w:before="80"/>
         <w:ind w:left="4950" w:hanging="3532"/>
@@ -563,32 +559,30 @@
           <w:lang w:val="es-CR"/>
         </w:rPr>
         <w:t>Supervisión Completada</w:t>
-      </w:r>
-      <w:r>
-        <w:rPr>
-          <w:lang w:val="es-CR"/>
-        </w:rPr>
         <w:tab/>
-      </w:r>
-      <w:r>
-        <w:rPr>
-          <w:lang w:val="es-CR"/>
-        </w:rPr>
-        <w:t>{</w:t>
+        <w:t>{supervision_completed_date}</w:t>
+      </w:r>
+      <w:r>
+        <w:rPr>
+          <w:lang w:val="es-CR"/>
+        </w:rPr>
+      </w:r>
+      <w:r>
+        <w:rPr>
+          <w:lang w:val="es-CR"/>
+        </w:rPr>
       </w:r>
       <w:proofErr w:type="spellStart"/>
       <w:r>
         <w:rPr>
           <w:lang w:val="es-CR"/>
         </w:rPr>
-        <w:t>supervision_completed_date</w:t>
       </w:r>
       <w:proofErr w:type="spellEnd"/>
       <w:r>
         <w:rPr>
           <w:lang w:val="es-CR"/>
         </w:rPr>
-        <w:t>}</w:t>
       </w:r>
     </w:p>
     <w:p>

</xml_diff>